<commit_message>
Enhance COMPASS documentation and add new question files
- Updated `AGENTS.md` with new sections on external-facing documents and cross-project planning for COMPASS.
- Added new question files for COMPASS to CODA, PEER, SCOUT, and VECTOR, detailing manuscript deliverables and inquiries for each domain.
- Introduced a new PDF file for the COMPASS to CODA questions to facilitate communication and clarity in the review process.
- Updated `statistics.json` timestamps for consistency across records.
</commit_message>
<xml_diff>
--- a/1-Various_PDE_and_Chat_stuff/5-Manuscript/advancement_under_constrained_distinction_dakota_feedback_v02_full.docx
+++ b/1-Various_PDE_and_Chat_stuff/5-Manuscript/advancement_under_constrained_distinction_dakota_feedback_v02_full.docx
@@ -156,21 +156,51 @@
       </w:r>
     </w:p>
     <w:p>
-      <w:r>
-        <w:t>Our current interpretation is intentionally modest.</w:t>
+      <w:pPr>
+        <w:sectPr>
+          <w:pgSz w:w="12240" w:h="15840"/>
+          <w:pgMar w:top="1440" w:right="1800" w:bottom="1440" w:left="1800" w:header="720" w:footer="720" w:gutter="0"/>
+          <w:cols w:space="720"/>
+          <w:docGrid w:linePitch="360"/>
+        </w:sectPr>
+      </w:pPr>
+      <w:r>
+        <w:t xml:space="preserve">Our current interpretation is intentionally </w:t>
+      </w:r>
+      <w:r>
+        <w:t>unassuming</w:t>
+      </w:r>
+      <w:r>
+        <w:t>.</w:t>
+      </w:r>
+      <w:r>
+        <w:t xml:space="preserve">  </w:t>
+      </w:r>
+      <w:r>
+        <w:t>We do not view the existing evidence as establishing causality. Rather, we view local talent concentration as creating two competing forces.</w:t>
       </w:r>
       <w:r>
         <w:br/>
       </w:r>
       <w:r>
         <w:br/>
-        <w:t>We do not view the existing evidence as establishing causality. Rather, we view local talent concentration as creating two competing forces.</w:t>
-      </w:r>
-      <w:r>
-        <w:br/>
-      </w:r>
-      <w:r>
-        <w:br/>
+      </w:r>
+    </w:p>
+    <w:p>
+      <w:pPr>
+        <w:sectPr>
+          <w:type w:val="continuous"/>
+          <w:pgSz w:w="12240" w:h="15840"/>
+          <w:pgMar w:top="1440" w:right="1800" w:bottom="1440" w:left="1800" w:header="720" w:footer="720" w:gutter="0"/>
+          <w:cols w:num="2" w:space="720"/>
+          <w:docGrid w:linePitch="360"/>
+        </w:sectPr>
+      </w:pPr>
+      <w:r>
+        <w:rPr>
+          <w:b/>
+          <w:bCs/>
+        </w:rPr>
         <w:t>Developmental Benefits:</w:t>
       </w:r>
       <w:r>
@@ -202,6 +232,12 @@
       </w:r>
       <w:r>
         <w:br/>
+      </w:r>
+      <w:r>
+        <w:rPr>
+          <w:b/>
+          <w:bCs/>
+        </w:rPr>
         <w:t>Competitive Constraints:</w:t>
       </w:r>
       <w:r>
@@ -222,11 +258,13 @@
       </w:r>
       <w:r>
         <w:br/>
-        <w:t>• evaluation compression</w:t>
-      </w:r>
-      <w:r>
-        <w:br/>
-      </w:r>
+        <w:t>• evaluation compressio</w:t>
+      </w:r>
+      <w:r>
+        <w:t>n</w:t>
+      </w:r>
+    </w:p>
+    <w:p>
       <w:r>
         <w:br/>
         <w:t>Our current working hypothesis is that advancement outcomes reflect the interaction of these opposing forces.</w:t>
@@ -252,17 +290,15 @@
         <w:t>Initial interpretations emphasized a distinction between local talent environments and globally constrained advancement opportunities. While that framing aligns naturally with promotion systems and professional sports drafts, academic tenure systems do not fit that structure as cleanly.</w:t>
       </w:r>
       <w:r>
+        <w:t xml:space="preserve">  </w:t>
+      </w:r>
+      <w:r>
+        <w:t>This led us toward a broader formulation centered on finite distinction capacity within local comparison environments.</w:t>
+      </w:r>
+      <w:r>
         <w:br/>
       </w:r>
       <w:r>
-        <w:br/>
-        <w:t>This led us toward a broader formulation centered on finite distinction capacity within local comparison environments.</w:t>
-      </w:r>
-      <w:r>
-        <w:br/>
-      </w:r>
-      <w:r>
-        <w:lastRenderedPageBreak/>
         <w:br/>
         <w:t>Under this view, advancement systems differ substantially in their implementation, but all require individuals to distinguish themselves within populations of talented peers competing for scarce recognition, opportunities, or advancement.</w:t>
       </w:r>
@@ -279,6 +315,7 @@
         <w:pStyle w:val="Heading2"/>
       </w:pPr>
       <w:r>
+        <w:lastRenderedPageBreak/>
         <w:t>4. Academic Tenure Setting (Current Status)</w:t>
       </w:r>
     </w:p>
@@ -315,24 +352,24 @@
       </w:r>
       <w:r>
         <w:t>Methodologically, one of the most appealing aspects of the academic setting is that it mirrors an important feature of the Army data. In both systems, individuals may either advance or exit before advancement occurs.</w:t>
+      </w:r>
+    </w:p>
+    <w:p>
+      <w:r>
+        <w:t>In the Army, this motivated the use of competing-risk approaches that distinguished promotion from separation and allowed us to examine advancement and attrition as simultaneous career processes rather than independent outcomes.</w:t>
+      </w:r>
+    </w:p>
+    <w:p>
+      <w:r>
+        <w:t>T</w:t>
+      </w:r>
+      <w:r>
+        <w:t>he academic setting presents a closely related challenge in the form of tenure attainment versus pre-tenure attrition. As a result, we are adapting the event-history framework developed for the Army analyses, including Cox proportional hazards models and competing-risk approaches such as the Fine-Gray method, to evaluate advancement and attrition simultaneously.</w:t>
       </w:r>
     </w:p>
     <w:p/>
     <w:p>
       <w:r>
-        <w:t>In the Army, this motivated the use of competing-risk approaches that distinguished promotion from separation and allowed us to examine advancement and attrition as simultaneous career processes rather than independent outcomes.</w:t>
-      </w:r>
-    </w:p>
-    <w:p/>
-    <w:p>
-      <w:r>
-        <w:t>The academic setting presents a closely related challenge in the form of tenure attainment versus pre-tenure attrition. As a result, we are adapting the event-history framework developed for the Army analyses, including Cox proportional hazards models and competing-risk approaches such as the Fine-Gray method, to evaluate advancement and attrition simultaneously.</w:t>
-      </w:r>
-    </w:p>
-    <w:p/>
-    <w:p>
-      <w:r>
-        <w:lastRenderedPageBreak/>
         <w:t>This parallel between military and academic careers may ultimately provide a useful bridge for understanding how local talent environments shape both advancement and persistence across otherwise very different domains.</w:t>
       </w:r>
     </w:p>
@@ -366,6 +403,7 @@
         <w:br/>
       </w:r>
       <w:r>
+        <w:lastRenderedPageBreak/>
         <w:br/>
         <w:t>We then introduced a minimal congestion mechanism representing pressure from comparable local peers.</w:t>
       </w:r>
@@ -458,7 +496,6 @@
         <w:pStyle w:val="Heading2"/>
       </w:pPr>
       <w:r>
-        <w:lastRenderedPageBreak/>
         <w:t>7. Predictions and Validation</w:t>
       </w:r>
     </w:p>
@@ -500,6 +537,7 @@
         <w:br/>
       </w:r>
       <w:r>
+        <w:lastRenderedPageBreak/>
         <w:br/>
         <w:t>These predictions provide a pathway from explanation toward empirical validation.</w:t>
       </w:r>
@@ -573,7 +611,13 @@
     <w:p/>
     <w:p>
       <w:r>
-        <w:t>Of course, please feel free to comment wherever you see fit. The topics below are simply areas where we suspect your perspective may be particularly valuable if they happen to resonate with you.</w:t>
+        <w:t xml:space="preserve">Of course, please feel free to comment wherever you see fit. The topics below are simply areas where </w:t>
+      </w:r>
+      <w:r>
+        <w:t>I</w:t>
+      </w:r>
+      <w:r>
+        <w:t xml:space="preserve"> suspect your perspective may be particularly valuable if they happen to resonate with you.</w:t>
       </w:r>
     </w:p>
     <w:p>
@@ -588,7 +632,6 @@
     </w:p>
     <w:p>
       <w:r>
-        <w:lastRenderedPageBreak/>
         <w:t>• Alternative ways of conceptualizing local comparison environments in academic careers.</w:t>
       </w:r>
     </w:p>
@@ -620,6 +663,7 @@
     </w:p>
     <w:p>
       <w:r>
+        <w:lastRenderedPageBreak/>
         <w:t>• Thoughts on the progression from minimal mechanism to richer explanatory models.</w:t>
       </w:r>
     </w:p>
@@ -679,6 +723,7 @@
       </w:r>
     </w:p>
     <w:sectPr>
+      <w:type w:val="continuous"/>
       <w:pgSz w:w="12240" w:h="15840"/>
       <w:pgMar w:top="1440" w:right="1800" w:bottom="1440" w:left="1800" w:header="720" w:footer="720" w:gutter="0"/>
       <w:cols w:space="720"/>

</xml_diff>